<commit_message>
Refactor and enhance Rappi AI project components
- Updated the main document to correct grammatical errors and improve clarity in the requirements section.
- Deleted outdated document to streamline project files.
- Added a README.md file detailing the project setup, architecture, and functionalities.
- Introduced new environment configuration example for backend setup.
- Enhanced backend tools and interfaces to support chart data visualization in responses.
- Improved frontend components for better user experience, including session persistence and dynamic chart rendering.
</commit_message>
<xml_diff>
--- a/Caso Técnico_ Sistema de Análisis Inteligente para Operaciones Rappi.docx
+++ b/Caso Técnico_ Sistema de Análisis Inteligente para Operaciones Rappi.docx
@@ -380,7 +380,6 @@
         <w:t xml:space="preserve"> </w:t>
       </w:r>
       <w:commentRangeStart w:id="4"/>
-      <w:commentRangeStart w:id="5"/>
       <w:r>
         <w:rPr>
           <w:color w:val="000000"/>
@@ -398,17 +397,6 @@
           <w:lang w:val="es-AR"/>
         </w:rPr>
         <w:commentReference w:id="4"/>
-      </w:r>
-      <w:commentRangeEnd w:id="5"/>
-      <w:r>
-        <w:rPr>
-          <w:rStyle w:val="CommentReference"/>
-          <w:color w:val="000000"/>
-          <w:sz w:val="22"/>
-          <w:szCs w:val="22"/>
-          <w:lang w:val="es-AR"/>
-        </w:rPr>
-        <w:commentReference w:id="5"/>
       </w:r>
     </w:p>
     <w:p>
@@ -456,12 +444,36 @@
         </w:rPr>
         <w:t xml:space="preserve">: </w:t>
       </w:r>
+      <w:commentRangeStart w:id="5"/>
+      <w:commentRangeStart w:id="6"/>
       <w:r>
         <w:rPr>
           <w:color w:val="000000"/>
           <w:lang w:val="es-AR"/>
         </w:rPr>
         <w:t xml:space="preserve">Cada semana los equipos dedican horas a identificar zonas con problemas, oportunidades de crecimiento y anomalías operacionales </w:t>
+      </w:r>
+      <w:commentRangeEnd w:id="5"/>
+      <w:r>
+        <w:rPr>
+          <w:rStyle w:val="CommentReference"/>
+          <w:color w:val="000000"/>
+          <w:sz w:val="22"/>
+          <w:szCs w:val="22"/>
+          <w:lang w:val="es-AR"/>
+        </w:rPr>
+        <w:commentReference w:id="5"/>
+      </w:r>
+      <w:commentRangeEnd w:id="6"/>
+      <w:r>
+        <w:rPr>
+          <w:rStyle w:val="CommentReference"/>
+          <w:color w:val="000000"/>
+          <w:sz w:val="22"/>
+          <w:szCs w:val="22"/>
+          <w:lang w:val="es-AR"/>
+        </w:rPr>
+        <w:commentReference w:id="6"/>
       </w:r>
     </w:p>
     <w:p>
@@ -690,7 +702,42 @@
           <w:color w:val="000000"/>
           <w:lang w:val="es-AR"/>
         </w:rPr>
-        <w:t xml:space="preserve">● Preguntas de filtrado: "¿Cuáles son las 5 zonas con mayor % Lead Penetration esta semana?" </w:t>
+        <w:t xml:space="preserve">● </w:t>
+      </w:r>
+      <w:r>
+        <w:rPr>
+          <w:color w:val="000000"/>
+          <w:highlight w:val="yellow"/>
+          <w:lang w:val="es-AR"/>
+        </w:rPr>
+        <w:t xml:space="preserve">Preguntas de filtrado: </w:t>
+      </w:r>
+      <w:commentRangeStart w:id="7"/>
+      <w:r>
+        <w:rPr>
+          <w:color w:val="000000"/>
+          <w:highlight w:val="yellow"/>
+          <w:lang w:val="es-AR"/>
+        </w:rPr>
+        <w:t>"¿Cuáles son las 5 zonas con mayor % Lead Penetration esta semana?"</w:t>
+      </w:r>
+      <w:r>
+        <w:rPr>
+          <w:color w:val="000000"/>
+          <w:lang w:val="es-AR"/>
+        </w:rPr>
+        <w:t xml:space="preserve"> </w:t>
+      </w:r>
+      <w:commentRangeEnd w:id="7"/>
+      <w:r>
+        <w:rPr>
+          <w:rStyle w:val="CommentReference"/>
+          <w:color w:val="000000"/>
+          <w:sz w:val="22"/>
+          <w:szCs w:val="22"/>
+          <w:lang w:val="es-AR"/>
+        </w:rPr>
+        <w:commentReference w:id="7"/>
       </w:r>
     </w:p>
     <w:p>
@@ -715,7 +762,51 @@
           <w:color w:val="000000"/>
           <w:lang w:val="es-AR"/>
         </w:rPr>
-        <w:t xml:space="preserve">● Comparaciones: "Compara el Perfect Order entre zonas Wealthy y Non Wealthy en México" </w:t>
+        <w:t>● Comparaciones</w:t>
+      </w:r>
+      <w:r>
+        <w:rPr>
+          <w:color w:val="000000"/>
+          <w:highlight w:val="yellow"/>
+          <w:lang w:val="es-AR"/>
+        </w:rPr>
+        <w:t xml:space="preserve">: "Compara el Perfect Order entre zonas Wealthy y Non Wealthy en </w:t>
+      </w:r>
+      <w:commentRangeStart w:id="8"/>
+      <w:r>
+        <w:rPr>
+          <w:color w:val="000000"/>
+          <w:highlight w:val="yellow"/>
+          <w:lang w:val="es-AR"/>
+        </w:rPr>
+        <w:t>México</w:t>
+      </w:r>
+      <w:commentRangeEnd w:id="8"/>
+      <w:r>
+        <w:rPr>
+          <w:rStyle w:val="CommentReference"/>
+          <w:color w:val="000000"/>
+          <w:sz w:val="22"/>
+          <w:szCs w:val="22"/>
+          <w:highlight w:val="yellow"/>
+          <w:lang w:val="es-AR"/>
+        </w:rPr>
+        <w:commentReference w:id="8"/>
+      </w:r>
+      <w:r>
+        <w:rPr>
+          <w:color w:val="000000"/>
+          <w:highlight w:val="yellow"/>
+          <w:lang w:val="es-AR"/>
+        </w:rPr>
+        <w:t>"</w:t>
+      </w:r>
+      <w:r>
+        <w:rPr>
+          <w:color w:val="000000"/>
+          <w:lang w:val="es-AR"/>
+        </w:rPr>
+        <w:t xml:space="preserve"> </w:t>
       </w:r>
     </w:p>
     <w:p>
@@ -740,7 +831,51 @@
           <w:color w:val="000000"/>
           <w:lang w:val="es-AR"/>
         </w:rPr>
-        <w:t xml:space="preserve">● Tendencias temporales: "Muestra la evolución de Gross Profit UE en Chapinero últimas 8 semanas" </w:t>
+        <w:t xml:space="preserve">● Tendencias temporales: </w:t>
+      </w:r>
+      <w:r>
+        <w:rPr>
+          <w:color w:val="000000"/>
+          <w:highlight w:val="yellow"/>
+          <w:lang w:val="es-AR"/>
+        </w:rPr>
+        <w:t xml:space="preserve">"Muestra la evolución de Gross Profit UE en Chapinero últimas 8 </w:t>
+      </w:r>
+      <w:commentRangeStart w:id="9"/>
+      <w:r>
+        <w:rPr>
+          <w:color w:val="000000"/>
+          <w:highlight w:val="yellow"/>
+          <w:lang w:val="es-AR"/>
+        </w:rPr>
+        <w:t>semanas</w:t>
+      </w:r>
+      <w:commentRangeEnd w:id="9"/>
+      <w:r>
+        <w:rPr>
+          <w:rStyle w:val="CommentReference"/>
+          <w:color w:val="000000"/>
+          <w:sz w:val="22"/>
+          <w:szCs w:val="22"/>
+          <w:highlight w:val="yellow"/>
+          <w:lang w:val="es-AR"/>
+        </w:rPr>
+        <w:commentReference w:id="9"/>
+      </w:r>
+      <w:r>
+        <w:rPr>
+          <w:color w:val="000000"/>
+          <w:highlight w:val="yellow"/>
+          <w:lang w:val="es-AR"/>
+        </w:rPr>
+        <w:t>"</w:t>
+      </w:r>
+      <w:r>
+        <w:rPr>
+          <w:color w:val="000000"/>
+          <w:lang w:val="es-AR"/>
+        </w:rPr>
+        <w:t xml:space="preserve"> </w:t>
       </w:r>
     </w:p>
     <w:p>
@@ -765,7 +900,44 @@
           <w:color w:val="000000"/>
           <w:lang w:val="es-AR"/>
         </w:rPr>
-        <w:t>● Agregaciones: "¿Cuál es el promedio de Lead Penetration por país?"</w:t>
+        <w:t xml:space="preserve">● Agregaciones: </w:t>
+      </w:r>
+      <w:r>
+        <w:rPr>
+          <w:color w:val="000000"/>
+          <w:highlight w:val="yellow"/>
+          <w:lang w:val="es-AR"/>
+        </w:rPr>
+        <w:t xml:space="preserve">"¿Cuál es el promedio de Lead Penetration por </w:t>
+      </w:r>
+      <w:commentRangeStart w:id="10"/>
+      <w:r>
+        <w:rPr>
+          <w:color w:val="000000"/>
+          <w:highlight w:val="yellow"/>
+          <w:lang w:val="es-AR"/>
+        </w:rPr>
+        <w:t>país</w:t>
+      </w:r>
+      <w:commentRangeEnd w:id="10"/>
+      <w:r>
+        <w:rPr>
+          <w:rStyle w:val="CommentReference"/>
+          <w:color w:val="000000"/>
+          <w:sz w:val="22"/>
+          <w:szCs w:val="22"/>
+          <w:highlight w:val="yellow"/>
+          <w:lang w:val="es-AR"/>
+        </w:rPr>
+        <w:commentReference w:id="10"/>
+      </w:r>
+      <w:r>
+        <w:rPr>
+          <w:color w:val="000000"/>
+          <w:highlight w:val="yellow"/>
+          <w:lang w:val="es-AR"/>
+        </w:rPr>
+        <w:t>?"</w:t>
       </w:r>
     </w:p>
     <w:p>
@@ -790,15 +962,43 @@
           <w:color w:val="000000"/>
           <w:lang w:val="es-AR"/>
         </w:rPr>
-        <w:t xml:space="preserve">● Análisis multivariable: "¿Qué zonas tienen alto Lead Penetration pero bajo Perfect </w:t>
-      </w:r>
-      <w:r>
-        <w:rPr>
-          <w:color w:val="000000"/>
+        <w:t xml:space="preserve">● </w:t>
+      </w:r>
+      <w:r>
+        <w:rPr>
+          <w:color w:val="000000"/>
+          <w:highlight w:val="yellow"/>
+          <w:lang w:val="es-AR"/>
+        </w:rPr>
+        <w:t xml:space="preserve">Análisis multivariable: "¿Qué zonas tienen alto Lead Penetration pero bajo Perfect </w:t>
+      </w:r>
+      <w:commentRangeStart w:id="11"/>
+      <w:r>
+        <w:rPr>
+          <w:color w:val="000000"/>
+          <w:highlight w:val="yellow"/>
           <w:lang w:val="es-AR"/>
         </w:rPr>
         <w:lastRenderedPageBreak/>
-        <w:t xml:space="preserve">Order?" </w:t>
+        <w:t>Order</w:t>
+      </w:r>
+      <w:commentRangeEnd w:id="11"/>
+      <w:r>
+        <w:rPr>
+          <w:rStyle w:val="CommentReference"/>
+          <w:color w:val="000000"/>
+          <w:sz w:val="22"/>
+          <w:szCs w:val="22"/>
+          <w:lang w:val="es-AR"/>
+        </w:rPr>
+        <w:commentReference w:id="11"/>
+      </w:r>
+      <w:r>
+        <w:rPr>
+          <w:color w:val="000000"/>
+          <w:lang w:val="es-AR"/>
+        </w:rPr>
+        <w:t xml:space="preserve">?" </w:t>
       </w:r>
     </w:p>
     <w:p>
@@ -826,7 +1026,14 @@
           <w:color w:val="000000"/>
           <w:lang w:val="es-AR"/>
         </w:rPr>
-        <w:t xml:space="preserve">● Preguntas de inferencia: ¿ </w:t>
+        <w:t xml:space="preserve">● Preguntas de inferencia: </w:t>
+      </w:r>
+      <w:r>
+        <w:rPr>
+          <w:color w:val="000000"/>
+          <w:lang w:val="es-AR"/>
+        </w:rPr>
+        <w:t>¿cuáles</w:t>
       </w:r>
       <w:r>
         <w:rPr>
@@ -837,7 +1044,7 @@
           <w:highlight w:val="white"/>
           <w:lang w:val="es-AR"/>
         </w:rPr>
-        <w:t>cuáles son las zonas que más crecen en órdenes en las</w:t>
+        <w:t xml:space="preserve"> son las zonas que más crecen en órdenes en las</w:t>
       </w:r>
       <w:r>
         <w:rPr>
@@ -890,6 +1097,9 @@
       </w:pPr>
       <w:sdt>
         <w:sdtPr>
+          <w:rPr>
+            <w:highlight w:val="yellow"/>
+          </w:rPr>
           <w:tag w:val="goog_rdk_1"/>
           <w:id w:val="-479611136"/>
         </w:sdtPr>
@@ -898,17 +1108,20 @@
             <w:rPr>
               <w:rFonts w:ascii="Arial Unicode MS" w:eastAsia="Arial Unicode MS" w:hAnsi="Arial Unicode MS" w:cs="Arial Unicode MS"/>
               <w:color w:val="000000"/>
+              <w:highlight w:val="yellow"/>
               <w:lang w:val="es-AR"/>
             </w:rPr>
             <w:t xml:space="preserve">✅ </w:t>
           </w:r>
         </w:sdtContent>
       </w:sdt>
-      <w:r>
-        <w:rPr>
-          <w:b/>
-          <w:bCs/>
-          <w:color w:val="000000"/>
+      <w:commentRangeStart w:id="12"/>
+      <w:r>
+        <w:rPr>
+          <w:b/>
+          <w:bCs/>
+          <w:color w:val="000000"/>
+          <w:highlight w:val="yellow"/>
           <w:lang w:val="es-AR"/>
         </w:rPr>
         <w:t xml:space="preserve">Manejo de contexto: </w:t>
@@ -916,9 +1129,28 @@
       <w:r>
         <w:rPr>
           <w:color w:val="000000"/>
-          <w:lang w:val="es-AR"/>
-        </w:rPr>
-        <w:t xml:space="preserve">El bot debe entender el contexto de negocio (ejemplo: si preguntan por "zonas problemáticas", debe inferir que son aquellas con métricas deterioradas). </w:t>
+          <w:highlight w:val="yellow"/>
+          <w:lang w:val="es-AR"/>
+        </w:rPr>
+        <w:t>El bot debe entender el contexto de negocio (ejemplo: si preguntan por "zonas problemáticas", debe inferir que son aquellas con métricas deterioradas).</w:t>
+      </w:r>
+      <w:r>
+        <w:rPr>
+          <w:color w:val="000000"/>
+          <w:lang w:val="es-AR"/>
+        </w:rPr>
+        <w:t xml:space="preserve"> </w:t>
+      </w:r>
+      <w:commentRangeEnd w:id="12"/>
+      <w:r>
+        <w:rPr>
+          <w:rStyle w:val="CommentReference"/>
+          <w:color w:val="000000"/>
+          <w:sz w:val="22"/>
+          <w:szCs w:val="22"/>
+          <w:lang w:val="es-AR"/>
+        </w:rPr>
+        <w:commentReference w:id="12"/>
       </w:r>
     </w:p>
     <w:p>
@@ -940,6 +1172,9 @@
       </w:pPr>
       <w:sdt>
         <w:sdtPr>
+          <w:rPr>
+            <w:highlight w:val="yellow"/>
+          </w:rPr>
           <w:tag w:val="goog_rdk_2"/>
           <w:id w:val="-695813383"/>
         </w:sdtPr>
@@ -948,17 +1183,20 @@
             <w:rPr>
               <w:rFonts w:ascii="Arial Unicode MS" w:eastAsia="Arial Unicode MS" w:hAnsi="Arial Unicode MS" w:cs="Arial Unicode MS"/>
               <w:color w:val="000000"/>
+              <w:highlight w:val="yellow"/>
               <w:lang w:val="es-AR"/>
             </w:rPr>
             <w:t xml:space="preserve">✅ </w:t>
           </w:r>
         </w:sdtContent>
       </w:sdt>
-      <w:r>
-        <w:rPr>
-          <w:b/>
-          <w:bCs/>
-          <w:color w:val="000000"/>
+      <w:commentRangeStart w:id="13"/>
+      <w:r>
+        <w:rPr>
+          <w:b/>
+          <w:bCs/>
+          <w:color w:val="000000"/>
+          <w:highlight w:val="yellow"/>
           <w:lang w:val="es-AR"/>
         </w:rPr>
         <w:t xml:space="preserve">Sugerencias </w:t>
@@ -966,9 +1204,37 @@
       <w:r>
         <w:rPr>
           <w:color w:val="000000"/>
-          <w:lang w:val="es-AR"/>
-        </w:rPr>
-        <w:t xml:space="preserve">proactivas de análisis. </w:t>
+          <w:highlight w:val="yellow"/>
+          <w:lang w:val="es-AR"/>
+        </w:rPr>
+        <w:t>proactivas de análisis</w:t>
+      </w:r>
+      <w:commentRangeEnd w:id="13"/>
+      <w:r>
+        <w:rPr>
+          <w:rStyle w:val="CommentReference"/>
+          <w:color w:val="000000"/>
+          <w:sz w:val="22"/>
+          <w:szCs w:val="22"/>
+          <w:highlight w:val="yellow"/>
+          <w:lang w:val="es-AR"/>
+        </w:rPr>
+        <w:commentReference w:id="13"/>
+      </w:r>
+      <w:r>
+        <w:rPr>
+          <w:color w:val="000000"/>
+          <w:highlight w:val="yellow"/>
+          <w:lang w:val="es-AR"/>
+        </w:rPr>
+        <w:t>.</w:t>
+      </w:r>
+      <w:r>
+        <w:rPr>
+          <w:color w:val="000000"/>
+          <w:lang w:val="es-AR"/>
+        </w:rPr>
+        <w:t xml:space="preserve"> </w:t>
       </w:r>
     </w:p>
     <w:p>
@@ -990,6 +1256,9 @@
       </w:pPr>
       <w:sdt>
         <w:sdtPr>
+          <w:rPr>
+            <w:highlight w:val="yellow"/>
+          </w:rPr>
           <w:tag w:val="goog_rdk_3"/>
           <w:id w:val="-324902657"/>
         </w:sdtPr>
@@ -998,6 +1267,7 @@
             <w:rPr>
               <w:rFonts w:ascii="Arial Unicode MS" w:eastAsia="Arial Unicode MS" w:hAnsi="Arial Unicode MS" w:cs="Arial Unicode MS"/>
               <w:color w:val="000000"/>
+              <w:highlight w:val="yellow"/>
               <w:lang w:val="es-AR"/>
             </w:rPr>
             <w:t xml:space="preserve">✅ </w:t>
@@ -1009,16 +1279,47 @@
           <w:b/>
           <w:bCs/>
           <w:color w:val="000000"/>
-          <w:lang w:val="es-AR"/>
-        </w:rPr>
-        <w:t xml:space="preserve">Memoria conversacional </w:t>
-      </w:r>
-      <w:r>
-        <w:rPr>
-          <w:color w:val="000000"/>
-          <w:lang w:val="es-AR"/>
-        </w:rPr>
-        <w:t xml:space="preserve">(seguimiento de diálogo). </w:t>
+          <w:highlight w:val="yellow"/>
+          <w:lang w:val="es-AR"/>
+        </w:rPr>
+        <w:t>Me</w:t>
+      </w:r>
+      <w:commentRangeStart w:id="14"/>
+      <w:r>
+        <w:rPr>
+          <w:b/>
+          <w:bCs/>
+          <w:color w:val="000000"/>
+          <w:highlight w:val="yellow"/>
+          <w:lang w:val="es-AR"/>
+        </w:rPr>
+        <w:t xml:space="preserve">moria conversacional </w:t>
+      </w:r>
+      <w:r>
+        <w:rPr>
+          <w:color w:val="000000"/>
+          <w:highlight w:val="yellow"/>
+          <w:lang w:val="es-AR"/>
+        </w:rPr>
+        <w:t>(seguimiento de diálogo).</w:t>
+      </w:r>
+      <w:r>
+        <w:rPr>
+          <w:color w:val="000000"/>
+          <w:lang w:val="es-AR"/>
+        </w:rPr>
+        <w:t xml:space="preserve"> </w:t>
+      </w:r>
+      <w:commentRangeEnd w:id="14"/>
+      <w:r>
+        <w:rPr>
+          <w:rStyle w:val="CommentReference"/>
+          <w:color w:val="000000"/>
+          <w:sz w:val="22"/>
+          <w:szCs w:val="22"/>
+          <w:lang w:val="es-AR"/>
+        </w:rPr>
+        <w:commentReference w:id="14"/>
       </w:r>
     </w:p>
     <w:p>
@@ -1081,14 +1382,56 @@
           <w:color w:val="000000"/>
           <w:lang w:val="es-AR"/>
         </w:rPr>
-        <w:t xml:space="preserve">Visualización de datos: </w:t>
-      </w:r>
-      <w:r>
-        <w:rPr>
-          <w:color w:val="000000"/>
-          <w:lang w:val="es-AR"/>
-        </w:rPr>
-        <w:t xml:space="preserve">Genera gráficos cuando la pregunta lo amerite (líneas para tendencias, barras para comparaciones, etc.) </w:t>
+        <w:t xml:space="preserve">Visualización de </w:t>
+      </w:r>
+      <w:commentRangeStart w:id="15"/>
+      <w:r>
+        <w:rPr>
+          <w:b/>
+          <w:bCs/>
+          <w:color w:val="000000"/>
+          <w:lang w:val="es-AR"/>
+        </w:rPr>
+        <w:t>datos</w:t>
+      </w:r>
+      <w:commentRangeEnd w:id="15"/>
+      <w:r>
+        <w:rPr>
+          <w:rStyle w:val="CommentReference"/>
+          <w:b/>
+          <w:bCs/>
+          <w:color w:val="000000"/>
+          <w:sz w:val="22"/>
+          <w:szCs w:val="22"/>
+          <w:highlight w:val="yellow"/>
+          <w:lang w:val="es-AR"/>
+        </w:rPr>
+        <w:commentReference w:id="15"/>
+      </w:r>
+      <w:r>
+        <w:rPr>
+          <w:b/>
+          <w:bCs/>
+          <w:color w:val="000000"/>
+          <w:highlight w:val="yellow"/>
+          <w:lang w:val="es-AR"/>
+        </w:rPr>
+        <w:t xml:space="preserve">: </w:t>
+      </w:r>
+      <w:r>
+        <w:rPr>
+          <w:color w:val="000000"/>
+          <w:highlight w:val="yellow"/>
+          <w:lang w:val="es-AR"/>
+        </w:rPr>
+        <w:t>Genera gráficos cuando la pregunta lo amerite (líneas para tendencias, barras para comparaciones, etc.)</w:t>
+      </w:r>
+      <w:r>
+        <w:rPr>
+          <w:color w:val="000000"/>
+          <w:lang w:val="es-AR"/>
+        </w:rPr>
+        <w:t xml:space="preserve"> </w:t>
       </w:r>
     </w:p>
     <w:p>
@@ -1113,7 +1456,43 @@
           <w:color w:val="000000"/>
           <w:lang w:val="es-AR"/>
         </w:rPr>
-        <w:t xml:space="preserve">● Exportación de resultados (CSV, PDF) </w:t>
+        <w:t xml:space="preserve">● </w:t>
+      </w:r>
+      <w:commentRangeStart w:id="16"/>
+      <w:r>
+        <w:rPr>
+          <w:color w:val="000000"/>
+          <w:highlight w:val="yellow"/>
+          <w:lang w:val="es-AR"/>
+        </w:rPr>
+        <w:t>Exportación</w:t>
+      </w:r>
+      <w:commentRangeEnd w:id="16"/>
+      <w:r>
+        <w:rPr>
+          <w:rStyle w:val="CommentReference"/>
+          <w:color w:val="000000"/>
+          <w:sz w:val="22"/>
+          <w:szCs w:val="22"/>
+          <w:highlight w:val="yellow"/>
+          <w:lang w:val="es-AR"/>
+        </w:rPr>
+        <w:commentReference w:id="16"/>
+      </w:r>
+      <w:r>
+        <w:rPr>
+          <w:color w:val="000000"/>
+          <w:highlight w:val="yellow"/>
+          <w:lang w:val="es-AR"/>
+        </w:rPr>
+        <w:t xml:space="preserve"> de resultados (CSV, PDF)</w:t>
+      </w:r>
+      <w:r>
+        <w:rPr>
+          <w:color w:val="000000"/>
+          <w:lang w:val="es-AR"/>
+        </w:rPr>
+        <w:t xml:space="preserve"> </w:t>
       </w:r>
     </w:p>
     <w:p>
@@ -1222,6 +1601,9 @@
       </w:pPr>
       <w:sdt>
         <w:sdtPr>
+          <w:rPr>
+            <w:highlight w:val="yellow"/>
+          </w:rPr>
           <w:tag w:val="goog_rdk_4"/>
           <w:id w:val="1674629802"/>
         </w:sdtPr>
@@ -1230,6 +1612,7 @@
             <w:rPr>
               <w:rFonts w:ascii="Arial Unicode MS" w:eastAsia="Arial Unicode MS" w:hAnsi="Arial Unicode MS" w:cs="Arial Unicode MS"/>
               <w:color w:val="000000"/>
+              <w:highlight w:val="yellow"/>
               <w:lang w:val="es-AR"/>
             </w:rPr>
             <w:t xml:space="preserve">✅ </w:t>
@@ -1241,16 +1624,37 @@
           <w:b/>
           <w:bCs/>
           <w:color w:val="000000"/>
+          <w:highlight w:val="yellow"/>
           <w:lang w:val="es-AR"/>
         </w:rPr>
         <w:t xml:space="preserve">Identificación automática de insights </w:t>
       </w:r>
-      <w:r>
-        <w:rPr>
-          <w:color w:val="000000"/>
-          <w:lang w:val="es-AR"/>
-        </w:rPr>
-        <w:t xml:space="preserve">en al menos estas categorías: </w:t>
+      <w:commentRangeStart w:id="17"/>
+      <w:r>
+        <w:rPr>
+          <w:color w:val="000000"/>
+          <w:highlight w:val="yellow"/>
+          <w:lang w:val="es-AR"/>
+        </w:rPr>
+        <w:t>en</w:t>
+      </w:r>
+      <w:commentRangeEnd w:id="17"/>
+      <w:r>
+        <w:rPr>
+          <w:rStyle w:val="CommentReference"/>
+          <w:color w:val="000000"/>
+          <w:sz w:val="22"/>
+          <w:szCs w:val="22"/>
+          <w:lang w:val="es-AR"/>
+        </w:rPr>
+        <w:commentReference w:id="17"/>
+      </w:r>
+      <w:r>
+        <w:rPr>
+          <w:color w:val="000000"/>
+          <w:lang w:val="es-AR"/>
+        </w:rPr>
+        <w:t xml:space="preserve"> al menos estas categorías: </w:t>
       </w:r>
     </w:p>
     <w:p>
@@ -1441,7 +1845,28 @@
           <w:color w:val="000000"/>
           <w:lang w:val="es-AR"/>
         </w:rPr>
-        <w:t>● Oportunidades en general</w:t>
+        <w:t xml:space="preserve">● Oportunidades en </w:t>
+      </w:r>
+      <w:commentRangeStart w:id="18"/>
+      <w:r>
+        <w:rPr>
+          <w:color w:val="000000"/>
+          <w:lang w:val="es-AR"/>
+        </w:rPr>
+        <w:t>general</w:t>
+      </w:r>
+      <w:commentRangeEnd w:id="18"/>
+      <w:r>
+        <w:rPr>
+          <w:rStyle w:val="CommentReference"/>
+          <w:b/>
+          <w:bCs/>
+          <w:color w:val="000000"/>
+          <w:sz w:val="22"/>
+          <w:szCs w:val="22"/>
+          <w:lang w:val="es-AR"/>
+        </w:rPr>
+        <w:commentReference w:id="18"/>
       </w:r>
       <w:r>
         <w:rPr>
@@ -1467,11 +1892,15 @@
         <w:ind w:left="10"/>
         <w:rPr>
           <w:color w:val="000000"/>
+          <w:highlight w:val="yellow"/>
           <w:lang w:val="es-AR"/>
         </w:rPr>
       </w:pPr>
       <w:sdt>
         <w:sdtPr>
+          <w:rPr>
+            <w:highlight w:val="yellow"/>
+          </w:rPr>
           <w:tag w:val="goog_rdk_5"/>
           <w:id w:val="-314952937"/>
         </w:sdtPr>
@@ -1480,6 +1909,7 @@
             <w:rPr>
               <w:rFonts w:ascii="Arial Unicode MS" w:eastAsia="Arial Unicode MS" w:hAnsi="Arial Unicode MS" w:cs="Arial Unicode MS"/>
               <w:color w:val="000000"/>
+              <w:highlight w:val="yellow"/>
               <w:lang w:val="es-AR"/>
             </w:rPr>
             <w:t xml:space="preserve">✅ </w:t>
@@ -1491,6 +1921,7 @@
           <w:b/>
           <w:bCs/>
           <w:color w:val="000000"/>
+          <w:highlight w:val="yellow"/>
           <w:lang w:val="es-AR"/>
         </w:rPr>
         <w:t xml:space="preserve">Reporte ejecutivo estructurado </w:t>
@@ -1498,6 +1929,7 @@
       <w:r>
         <w:rPr>
           <w:color w:val="000000"/>
+          <w:highlight w:val="yellow"/>
           <w:lang w:val="es-AR"/>
         </w:rPr>
         <w:t xml:space="preserve">que incluya: </w:t>
@@ -1517,12 +1949,14 @@
         <w:ind w:left="389"/>
         <w:rPr>
           <w:color w:val="000000"/>
-          <w:lang w:val="es-AR"/>
-        </w:rPr>
-      </w:pPr>
-      <w:r>
-        <w:rPr>
-          <w:color w:val="000000"/>
+          <w:highlight w:val="yellow"/>
+          <w:lang w:val="es-AR"/>
+        </w:rPr>
+      </w:pPr>
+      <w:r>
+        <w:rPr>
+          <w:color w:val="000000"/>
+          <w:highlight w:val="yellow"/>
           <w:lang w:val="es-AR"/>
         </w:rPr>
         <w:t xml:space="preserve">● Resumen ejecutivo (top 3-5 hallazgos críticos) </w:t>
@@ -1542,12 +1976,14 @@
         <w:ind w:left="389"/>
         <w:rPr>
           <w:color w:val="000000"/>
-          <w:lang w:val="es-AR"/>
-        </w:rPr>
-      </w:pPr>
-      <w:r>
-        <w:rPr>
-          <w:color w:val="000000"/>
+          <w:highlight w:val="yellow"/>
+          <w:lang w:val="es-AR"/>
+        </w:rPr>
+      </w:pPr>
+      <w:r>
+        <w:rPr>
+          <w:color w:val="000000"/>
+          <w:highlight w:val="yellow"/>
           <w:lang w:val="es-AR"/>
         </w:rPr>
         <w:t xml:space="preserve">● Detalle por categoría de insight </w:t>
@@ -1573,11 +2009,20 @@
       <w:r>
         <w:rPr>
           <w:color w:val="000000"/>
-          <w:lang w:val="es-AR"/>
-        </w:rPr>
-        <w:t xml:space="preserve">● Recomendaciones accionables para cada hallazgo </w:t>
-      </w:r>
-    </w:p>
+          <w:highlight w:val="yellow"/>
+          <w:lang w:val="es-AR"/>
+        </w:rPr>
+        <w:t>● Recomendaciones accionables para cada hallazgo</w:t>
+      </w:r>
+      <w:r>
+        <w:rPr>
+          <w:color w:val="000000"/>
+          <w:lang w:val="es-AR"/>
+        </w:rPr>
+        <w:t xml:space="preserve"> </w:t>
+      </w:r>
+    </w:p>
+    <w:commentRangeStart w:id="19"/>
     <w:p>
       <w:pPr>
         <w:widowControl w:val="0"/>
@@ -1591,14 +2036,15 @@
         <w:spacing w:before="274" w:line="482" w:lineRule="auto"/>
         <w:ind w:left="26" w:right="1851" w:hanging="16"/>
         <w:rPr>
-          <w:b/>
-          <w:bCs/>
           <w:color w:val="000000"/>
           <w:lang w:val="es-AR"/>
         </w:rPr>
       </w:pPr>
       <w:sdt>
         <w:sdtPr>
+          <w:rPr>
+            <w:highlight w:val="yellow"/>
+          </w:rPr>
           <w:tag w:val="goog_rdk_6"/>
           <w:id w:val="-538022042"/>
         </w:sdtPr>
@@ -1607,6 +2053,7 @@
             <w:rPr>
               <w:rFonts w:ascii="Arial Unicode MS" w:eastAsia="Arial Unicode MS" w:hAnsi="Arial Unicode MS" w:cs="Arial Unicode MS"/>
               <w:color w:val="000000"/>
+              <w:highlight w:val="yellow"/>
               <w:lang w:val="es-AR"/>
             </w:rPr>
             <w:t xml:space="preserve">✅ </w:t>
@@ -1618,6 +2065,7 @@
           <w:b/>
           <w:bCs/>
           <w:color w:val="000000"/>
+          <w:highlight w:val="yellow"/>
           <w:lang w:val="es-AR"/>
         </w:rPr>
         <w:t xml:space="preserve">Formato de salida: </w:t>
@@ -1625,17 +2073,74 @@
       <w:r>
         <w:rPr>
           <w:color w:val="000000"/>
-          <w:lang w:val="es-AR"/>
-        </w:rPr>
-        <w:t xml:space="preserve">Markdown, HTML o PDF (elige el más apropiado) </w:t>
-      </w:r>
-      <w:r>
-        <w:rPr>
-          <w:b/>
-          <w:bCs/>
-          <w:color w:val="000000"/>
-          <w:lang w:val="es-AR"/>
-        </w:rPr>
+          <w:highlight w:val="yellow"/>
+          <w:lang w:val="es-AR"/>
+        </w:rPr>
+        <w:t>Markdown, HTML o PDF (elige el más</w:t>
+      </w:r>
+      <w:r>
+        <w:rPr>
+          <w:color w:val="000000"/>
+          <w:highlight w:val="yellow"/>
+          <w:lang w:val="es-AR"/>
+        </w:rPr>
+        <w:t xml:space="preserve"> </w:t>
+      </w:r>
+      <w:commentRangeEnd w:id="19"/>
+      <w:r>
+        <w:rPr>
+          <w:rStyle w:val="CommentReference"/>
+          <w:color w:val="000000"/>
+          <w:sz w:val="22"/>
+          <w:szCs w:val="22"/>
+          <w:highlight w:val="yellow"/>
+          <w:lang w:val="es-AR"/>
+        </w:rPr>
+        <w:commentReference w:id="19"/>
+      </w:r>
+      <w:r>
+        <w:rPr>
+          <w:color w:val="000000"/>
+          <w:highlight w:val="yellow"/>
+          <w:lang w:val="es-AR"/>
+        </w:rPr>
+        <w:t>apropiado)</w:t>
+      </w:r>
+      <w:r>
+        <w:rPr>
+          <w:color w:val="000000"/>
+          <w:lang w:val="es-AR"/>
+        </w:rPr>
+        <w:t xml:space="preserve"> </w:t>
+      </w:r>
+    </w:p>
+    <w:p>
+      <w:pPr>
+        <w:widowControl w:val="0"/>
+        <w:pBdr>
+          <w:top w:val="nil"/>
+          <w:left w:val="nil"/>
+          <w:bottom w:val="nil"/>
+          <w:right w:val="nil"/>
+          <w:between w:val="nil"/>
+        </w:pBdr>
+        <w:spacing w:before="274" w:line="482" w:lineRule="auto"/>
+        <w:ind w:left="26" w:right="1851" w:hanging="16"/>
+        <w:rPr>
+          <w:b/>
+          <w:bCs/>
+          <w:color w:val="000000"/>
+          <w:lang w:val="es-AR"/>
+        </w:rPr>
+      </w:pPr>
+      <w:r>
+        <w:rPr>
+          <w:b/>
+          <w:bCs/>
+          <w:color w:val="000000"/>
+          <w:lang w:val="es-AR"/>
+        </w:rPr>
+        <w:lastRenderedPageBreak/>
         <w:t>Bonus (no obligatorio):</w:t>
       </w:r>
     </w:p>
@@ -1694,7 +2199,6 @@
           <w:szCs w:val="34"/>
           <w:lang w:val="es-AR"/>
         </w:rPr>
-        <w:lastRenderedPageBreak/>
         <w:t xml:space="preserve">3. Datos Proporcionados </w:t>
       </w:r>
     </w:p>
@@ -1807,14 +2311,12 @@
               <w:rPr>
                 <w:b/>
                 <w:bCs/>
-                <w:color w:val="FFFFFF"/>
               </w:rPr>
             </w:pPr>
             <w:r>
               <w:rPr>
                 <w:b/>
                 <w:bCs/>
-                <w:color w:val="FFFFFF"/>
               </w:rPr>
               <w:t xml:space="preserve">Columna </w:t>
             </w:r>
@@ -1846,14 +2348,12 @@
               <w:rPr>
                 <w:b/>
                 <w:bCs/>
-                <w:color w:val="FFFFFF"/>
               </w:rPr>
             </w:pPr>
             <w:r>
               <w:rPr>
                 <w:b/>
                 <w:bCs/>
-                <w:color w:val="FFFFFF"/>
               </w:rPr>
               <w:t xml:space="preserve">Tipo </w:t>
             </w:r>
@@ -1884,14 +2384,12 @@
               <w:rPr>
                 <w:b/>
                 <w:bCs/>
-                <w:color w:val="FFFFFF"/>
               </w:rPr>
             </w:pPr>
             <w:r>
               <w:rPr>
                 <w:b/>
                 <w:bCs/>
-                <w:color w:val="FFFFFF"/>
               </w:rPr>
               <w:t>Descripción</w:t>
             </w:r>
@@ -2578,6 +3076,7 @@
               <w:rPr>
                 <w:color w:val="000000"/>
               </w:rPr>
+              <w:lastRenderedPageBreak/>
               <w:t xml:space="preserve">L8W_VALUE a </w:t>
             </w:r>
           </w:p>
@@ -2800,7 +3299,6 @@
                 <w:bCs/>
                 <w:color w:val="000000"/>
               </w:rPr>
-              <w:lastRenderedPageBreak/>
               <w:t xml:space="preserve">Columna </w:t>
             </w:r>
           </w:p>
@@ -3600,6 +4098,7 @@
                 <w:sz w:val="20"/>
                 <w:szCs w:val="20"/>
               </w:rPr>
+              <w:lastRenderedPageBreak/>
               <w:t>MLTV Top Verticals Adoption</w:t>
             </w:r>
           </w:p>
@@ -3847,7 +4346,6 @@
                 <w:sz w:val="20"/>
                 <w:szCs w:val="20"/>
               </w:rPr>
-              <w:lastRenderedPageBreak/>
               <w:t xml:space="preserve">Pro Adoption </w:t>
             </w:r>
           </w:p>
@@ -4650,7 +5148,32 @@
           <w:color w:val="000000"/>
           <w:lang w:val="es-AR"/>
         </w:rPr>
-        <w:t xml:space="preserve">Streamlit, Gradio, Flask, FastAPI, Next.js, React, o lo que prefieras ● Si usas APIs pagas, </w:t>
+        <w:t>Streamlit, Gradio, Flask, FastAPI, Next.js, React, o lo que prefieras</w:t>
+      </w:r>
+    </w:p>
+    <w:p>
+      <w:pPr>
+        <w:widowControl w:val="0"/>
+        <w:pBdr>
+          <w:top w:val="nil"/>
+          <w:left w:val="nil"/>
+          <w:bottom w:val="nil"/>
+          <w:right w:val="nil"/>
+          <w:between w:val="nil"/>
+        </w:pBdr>
+        <w:spacing w:before="34" w:line="264" w:lineRule="auto"/>
+        <w:ind w:left="389" w:right="131"/>
+        <w:rPr>
+          <w:color w:val="000000"/>
+          <w:lang w:val="es-AR"/>
+        </w:rPr>
+      </w:pPr>
+      <w:r>
+        <w:rPr>
+          <w:color w:val="000000"/>
+          <w:lang w:val="es-AR"/>
+        </w:rPr>
+        <w:t xml:space="preserve">● Si usas APIs pagas, </w:t>
       </w:r>
       <w:r>
         <w:rPr>
@@ -4699,6 +5222,7 @@
           <w:szCs w:val="26"/>
           <w:lang w:val="es-AR"/>
         </w:rPr>
+        <w:lastRenderedPageBreak/>
         <w:t xml:space="preserve">Código y Reproducibilidad </w:t>
       </w:r>
     </w:p>
@@ -4858,15 +5382,7 @@
           <w:color w:val="000000"/>
           <w:lang w:val="es-AR"/>
         </w:rPr>
-        <w:t xml:space="preserve">Si usas plataformas como Make o n8n, exporta los workflows/blueprints e incluye </w:t>
-      </w:r>
-      <w:r>
-        <w:rPr>
-          <w:color w:val="000000"/>
-          <w:lang w:val="es-AR"/>
-        </w:rPr>
-        <w:lastRenderedPageBreak/>
-        <w:t>instrucciones de importación.</w:t>
+        <w:t>Si usas plataformas como Make o n8n, exporta los workflows/blueprints e incluye instrucciones de importación.</w:t>
       </w:r>
     </w:p>
     <w:p>
@@ -5428,6 +5944,7 @@
           <w:color w:val="000000"/>
           <w:lang w:val="es-AR"/>
         </w:rPr>
+        <w:lastRenderedPageBreak/>
         <w:t xml:space="preserve">● </w:t>
       </w:r>
       <w:r>
@@ -5625,7 +6142,6 @@
           <w:szCs w:val="26"/>
           <w:lang w:val="es-AR"/>
         </w:rPr>
-        <w:lastRenderedPageBreak/>
         <w:t xml:space="preserve">Presentación (30 minutos) </w:t>
       </w:r>
     </w:p>
@@ -5767,7 +6283,7 @@
         </w:rPr>
         <w:t xml:space="preserve">(5 min): Arquitectura, elección de LLM, </w:t>
       </w:r>
-      <w:commentRangeStart w:id="6"/>
+      <w:commentRangeStart w:id="20"/>
       <w:r>
         <w:rPr>
           <w:color w:val="000000"/>
@@ -5775,7 +6291,7 @@
         </w:rPr>
         <w:t xml:space="preserve">trade-offs principales </w:t>
       </w:r>
-      <w:commentRangeEnd w:id="6"/>
+      <w:commentRangeEnd w:id="20"/>
       <w:r>
         <w:rPr>
           <w:rStyle w:val="CommentReference"/>
@@ -5784,7 +6300,7 @@
           <w:szCs w:val="22"/>
           <w:lang w:val="es-AR"/>
         </w:rPr>
-        <w:commentReference w:id="6"/>
+        <w:commentReference w:id="20"/>
       </w:r>
       <w:r>
         <w:rPr>
@@ -6283,6 +6799,7 @@
           <w:color w:val="000000"/>
           <w:lang w:val="es-AR"/>
         </w:rPr>
+        <w:lastRenderedPageBreak/>
         <w:t xml:space="preserve">Envío de materiales: </w:t>
       </w:r>
       <w:r>
@@ -6906,7 +7423,14 @@
         <w:rPr>
           <w:lang w:val="es-AR"/>
         </w:rPr>
-        <w:t>La skill encapsula el System Prompt con todo el contexto de dominio Rappi: el diccionario completo de métricas (Lead Penetration, Perfect Order, Gross Profit UE, etc.), los 9 países, los tipos de zona (Wealthy / Non Wealthy) y las reglas de negocio. Por ejemplo, la skill enseña a Claude que "zonas problemáticas" = zonas con 3+ semanas de deterioro en métricas clave. El usuario invoca /</w:t>
+        <w:t xml:space="preserve">La skill encapsula el System Prompt con todo el contexto de dominio Rappi: el diccionario completo de métricas (Lead Penetration, Perfect Order, Gross Profit UE, etc.), los 9 </w:t>
+      </w:r>
+      <w:r>
+        <w:rPr>
+          <w:lang w:val="es-AR"/>
+        </w:rPr>
+        <w:lastRenderedPageBreak/>
+        <w:t>países, los tipos de zona (Wealthy / Non Wealthy) y las reglas de negocio. Por ejemplo, la skill enseña a Claude que "zonas problemáticas" = zonas con 3+ semanas de deterioro en métricas clave. El usuario invoca /</w:t>
       </w:r>
       <w:r>
         <w:rPr>
@@ -6997,7 +7521,6 @@
         <w:pStyle w:val="ListBullet2"/>
       </w:pPr>
       <w:r>
-        <w:lastRenderedPageBreak/>
         <w:t>compare_segments(metric, zone_type, country) → compara Wealthy vs Non Wealthy</w:t>
       </w:r>
     </w:p>
@@ -7257,14 +7780,14 @@
         </w:rPr>
         <w:t xml:space="preserve">Skill (/insights-report): Skill dedicada al Sistema de </w:t>
       </w:r>
-      <w:commentRangeStart w:id="7"/>
+      <w:commentRangeStart w:id="21"/>
       <w:r>
         <w:rPr>
           <w:lang w:val="es-AR"/>
         </w:rPr>
         <w:t xml:space="preserve">Insights </w:t>
       </w:r>
-      <w:commentRangeEnd w:id="7"/>
+      <w:commentRangeEnd w:id="21"/>
       <w:r>
         <w:rPr>
           <w:rStyle w:val="CommentReference"/>
@@ -7272,7 +7795,7 @@
           <w:szCs w:val="22"/>
           <w:lang w:val="es-AR"/>
         </w:rPr>
-        <w:commentReference w:id="7"/>
+        <w:commentReference w:id="21"/>
       </w:r>
       <w:r>
         <w:rPr>
@@ -7305,6 +7828,7 @@
         <w:rPr>
           <w:lang w:val="es-AR"/>
         </w:rPr>
+        <w:lastRenderedPageBreak/>
         <w:t>Prompt Caching: El diccionario de métricas (13 métricas con sus definiciones) y el contexto de negocio Rappi se marcan como bloque cacheable en la API. Esto evita re-procesar el mismo contexto en cada llamada semanal del reporte y en cada turno del bot conversacional. Reducción estimada de costo: ~60-70% en tokens de input para sesiones largas.</w:t>
       </w:r>
     </w:p>
@@ -7369,7 +7893,6 @@
         <w:rPr>
           <w:lang w:val="es-AR"/>
         </w:rPr>
-        <w:lastRenderedPageBreak/>
         <w:t>Tendencias preocupantes: pendiente negativa en ventana de 3+ semanas → función detect_trends(df, min_weeks=3)</w:t>
       </w:r>
     </w:p>
@@ -7688,14 +8211,14 @@
         </w:rPr>
         <w:t xml:space="preserve">Paso 4: Crear la skill /insights-report (Insights Automáticos — 30% del peso): Configurar la skill para recibir los hallazgos pre-procesados (listas de anomalías, tendencias, correlaciones, </w:t>
       </w:r>
-      <w:commentRangeStart w:id="8"/>
+      <w:commentRangeStart w:id="22"/>
       <w:r>
         <w:rPr>
           <w:lang w:val="es-AR"/>
         </w:rPr>
         <w:t>benchmarks</w:t>
       </w:r>
-      <w:commentRangeEnd w:id="8"/>
+      <w:commentRangeEnd w:id="22"/>
       <w:r>
         <w:rPr>
           <w:rStyle w:val="CommentReference"/>
@@ -7703,7 +8226,7 @@
           <w:szCs w:val="22"/>
           <w:lang w:val="es-AR"/>
         </w:rPr>
-        <w:commentReference w:id="8"/>
+        <w:commentReference w:id="22"/>
       </w:r>
       <w:r>
         <w:rPr>
@@ -7728,7 +8251,14 @@
         <w:rPr>
           <w:lang w:val="es-AR"/>
         </w:rPr>
-        <w:t>El prompt de la skill instruye a Claude a priorizar por impacto operacional, incluir recomendaciones accionables y limitar el resumen ejecutivo a los top 5 hallazgos. Criterio de éxito: reporte generado en &lt; 60 segundos con los 5 tipos de insight del enunciado.</w:t>
+        <w:t xml:space="preserve">El prompt de la skill instruye a Claude a priorizar por impacto operacional, incluir recomendaciones accionables y limitar el resumen ejecutivo a los top 5 hallazgos. </w:t>
+      </w:r>
+      <w:r>
+        <w:rPr>
+          <w:lang w:val="es-AR"/>
+        </w:rPr>
+        <w:lastRenderedPageBreak/>
+        <w:t>Criterio de éxito: reporte generado en &lt; 60 segundos con los 5 tipos de insight del enunciado.</w:t>
       </w:r>
     </w:p>
     <w:p>
@@ -7792,14 +8322,7 @@
         <w:rPr>
           <w:lang w:val="es-AR"/>
         </w:rPr>
-        <w:t xml:space="preserve"> cuando la tool retorne datos </w:t>
-      </w:r>
-      <w:r>
-        <w:rPr>
-          <w:lang w:val="es-AR"/>
-        </w:rPr>
-        <w:lastRenderedPageBreak/>
-        <w:t>visualizables. Agregar botón de exportación CSV/PDF como bonus. Criterio de éxito: un Operational Manager puede usar el sistema sin explicación previa.</w:t>
+        <w:t xml:space="preserve"> cuando la tool retorne datos visualizables. Agregar botón de exportación CSV/PDF como bonus. Criterio de éxito: un Operational Manager puede usar el sistema sin explicación previa.</w:t>
       </w:r>
     </w:p>
     <w:p>
@@ -8332,7 +8855,7 @@
       </w:r>
     </w:p>
   </w:comment>
-  <w:comment w:id="5" w:author="carlos jesus" w:date="2026-04-27T14:14:00Z" w:initials="cj">
+  <w:comment w:id="5" w:author="carlos jesus" w:date="2026-04-28T18:52:00Z" w:initials="cj">
     <w:p>
       <w:pPr>
         <w:pStyle w:val="CommentText"/>
@@ -8345,13 +8868,13 @@
       </w:r>
       <w:r>
         <w:rPr>
-          <w:lang w:val="es-US"/>
-        </w:rPr>
-        <w:t>- Se podria configurar una /skill llamado insight para obtener los datos?</w:t>
+          <w:lang w:val="es-AR"/>
+        </w:rPr>
+        <w:t>Usuario - trigger - reporte</w:t>
       </w:r>
     </w:p>
   </w:comment>
-  <w:comment w:id="6" w:author="carlos jesus" w:date="2026-04-27T21:39:00Z" w:initials="cj">
+  <w:comment w:id="6" w:author="carlos jesus" w:date="2026-04-28T18:54:00Z" w:initials="cj">
     <w:p>
       <w:pPr>
         <w:pStyle w:val="CommentText"/>
@@ -8366,11 +8889,277 @@
         <w:rPr>
           <w:lang w:val="es-AR"/>
         </w:rPr>
+        <w:t>Se podria automatizar con un hooks- cron?</w:t>
+      </w:r>
+    </w:p>
+  </w:comment>
+  <w:comment w:id="7" w:author="carlos jesus" w:date="2026-04-28T17:25:00Z" w:initials="cj">
+    <w:p>
+      <w:pPr>
+        <w:pStyle w:val="CommentText"/>
+      </w:pPr>
+      <w:r>
+        <w:rPr>
+          <w:rStyle w:val="CommentReference"/>
+        </w:rPr>
+        <w:annotationRef/>
+      </w:r>
+      <w:r>
+        <w:rPr>
+          <w:lang w:val="es-AR"/>
+        </w:rPr>
+        <w:t>Filtro testeado ✅</w:t>
+      </w:r>
+    </w:p>
+  </w:comment>
+  <w:comment w:id="8" w:author="carlos jesus" w:date="2026-04-28T17:38:00Z" w:initials="cj">
+    <w:p>
+      <w:pPr>
+        <w:pStyle w:val="CommentText"/>
+      </w:pPr>
+      <w:r>
+        <w:rPr>
+          <w:rStyle w:val="CommentReference"/>
+        </w:rPr>
+        <w:annotationRef/>
+      </w:r>
+      <w:r>
+        <w:rPr>
+          <w:lang w:val="es-AR"/>
+        </w:rPr>
+        <w:t>Comparación testeada ✅</w:t>
+      </w:r>
+    </w:p>
+  </w:comment>
+  <w:comment w:id="9" w:author="carlos jesus" w:date="2026-04-28T17:44:00Z" w:initials="cj">
+    <w:p>
+      <w:pPr>
+        <w:pStyle w:val="CommentText"/>
+      </w:pPr>
+      <w:r>
+        <w:rPr>
+          <w:rStyle w:val="CommentReference"/>
+        </w:rPr>
+        <w:annotationRef/>
+      </w:r>
+      <w:r>
+        <w:rPr>
+          <w:lang w:val="es-AR"/>
+        </w:rPr>
+        <w:t>Tendencia testeada ✅</w:t>
+      </w:r>
+    </w:p>
+  </w:comment>
+  <w:comment w:id="10" w:author="carlos jesus" w:date="2026-04-28T18:28:00Z" w:initials="cj">
+    <w:p>
+      <w:pPr>
+        <w:pStyle w:val="CommentText"/>
+      </w:pPr>
+      <w:r>
+        <w:rPr>
+          <w:rStyle w:val="CommentReference"/>
+        </w:rPr>
+        <w:annotationRef/>
+      </w:r>
+      <w:r>
+        <w:rPr>
+          <w:lang w:val="es-AR"/>
+        </w:rPr>
+        <w:t>Agregacion testeada ✅</w:t>
+      </w:r>
+    </w:p>
+  </w:comment>
+  <w:comment w:id="11" w:author="carlos jesus" w:date="2026-04-28T19:12:00Z" w:initials="cj">
+    <w:p>
+      <w:pPr>
+        <w:pStyle w:val="CommentText"/>
+      </w:pPr>
+      <w:r>
+        <w:rPr>
+          <w:rStyle w:val="CommentReference"/>
+        </w:rPr>
+        <w:annotationRef/>
+      </w:r>
+      <w:r>
+        <w:rPr>
+          <w:lang w:val="es-AR"/>
+        </w:rPr>
+        <w:t>✅</w:t>
+      </w:r>
+    </w:p>
+  </w:comment>
+  <w:comment w:id="12" w:author="carlos jesus" w:date="2026-04-28T19:15:00Z" w:initials="cj">
+    <w:p>
+      <w:pPr>
+        <w:pStyle w:val="CommentText"/>
+      </w:pPr>
+      <w:r>
+        <w:rPr>
+          <w:rStyle w:val="CommentReference"/>
+        </w:rPr>
+        <w:annotationRef/>
+      </w:r>
+      <w:r>
+        <w:rPr>
+          <w:lang w:val="es-AR"/>
+        </w:rPr>
+        <w:t>Implementado ✅</w:t>
+      </w:r>
+    </w:p>
+  </w:comment>
+  <w:comment w:id="13" w:author="carlos jesus" w:date="2026-04-28T19:15:00Z" w:initials="cj">
+    <w:p>
+      <w:pPr>
+        <w:pStyle w:val="CommentText"/>
+      </w:pPr>
+      <w:r>
+        <w:rPr>
+          <w:rStyle w:val="CommentReference"/>
+        </w:rPr>
+        <w:annotationRef/>
+      </w:r>
+      <w:r>
+        <w:rPr>
+          <w:lang w:val="es-AR"/>
+        </w:rPr>
+        <w:t>El chat bot sugiere analisis en cada rpta ✅</w:t>
+      </w:r>
+    </w:p>
+  </w:comment>
+  <w:comment w:id="14" w:author="carlos jesus" w:date="2026-04-28T19:16:00Z" w:initials="cj">
+    <w:p>
+      <w:pPr>
+        <w:pStyle w:val="CommentText"/>
+      </w:pPr>
+      <w:r>
+        <w:rPr>
+          <w:rStyle w:val="CommentReference"/>
+        </w:rPr>
+        <w:annotationRef/>
+      </w:r>
+      <w:r>
+        <w:rPr>
+          <w:lang w:val="es-AR"/>
+        </w:rPr>
+        <w:t>El chat persiste la conversacion en el tiempo</w:t>
+      </w:r>
+    </w:p>
+  </w:comment>
+  <w:comment w:id="15" w:author="carlos jesus" w:date="2026-04-28T19:41:00Z" w:initials="cj">
+    <w:p>
+      <w:pPr>
+        <w:pStyle w:val="CommentText"/>
+      </w:pPr>
+      <w:r>
+        <w:rPr>
+          <w:rStyle w:val="CommentReference"/>
+        </w:rPr>
+        <w:annotationRef/>
+      </w:r>
+      <w:r>
+        <w:rPr>
+          <w:lang w:val="es-AR"/>
+        </w:rPr>
+        <w:t>Graficos renderizados cuando la rpta tiene comparaciones en insigths</w:t>
+      </w:r>
+    </w:p>
+  </w:comment>
+  <w:comment w:id="16" w:author="carlos jesus" w:date="2026-04-28T19:33:00Z" w:initials="cj">
+    <w:p>
+      <w:pPr>
+        <w:pStyle w:val="CommentText"/>
+      </w:pPr>
+      <w:r>
+        <w:rPr>
+          <w:rStyle w:val="CommentReference"/>
+        </w:rPr>
+        <w:annotationRef/>
+      </w:r>
+      <w:r>
+        <w:rPr>
+          <w:lang w:val="es-AR"/>
+        </w:rPr>
+        <w:t>Csv implementado ✅</w:t>
+      </w:r>
+    </w:p>
+  </w:comment>
+  <w:comment w:id="17" w:author="carlos jesus" w:date="2026-04-28T20:19:00Z" w:initials="cj">
+    <w:p>
+      <w:pPr>
+        <w:pStyle w:val="CommentText"/>
+      </w:pPr>
+      <w:r>
+        <w:rPr>
+          <w:rStyle w:val="CommentReference"/>
+        </w:rPr>
+        <w:annotationRef/>
+      </w:r>
+      <w:r>
+        <w:rPr>
+          <w:lang w:val="es-AR"/>
+        </w:rPr>
+        <w:t>Todo los puntos completos ✅</w:t>
+      </w:r>
+    </w:p>
+  </w:comment>
+  <w:comment w:id="18" w:author="carlos jesus" w:date="2026-04-28T20:05:00Z" w:initials="cj">
+    <w:p>
+      <w:pPr>
+        <w:pStyle w:val="CommentText"/>
+      </w:pPr>
+      <w:r>
+        <w:rPr>
+          <w:rStyle w:val="CommentReference"/>
+        </w:rPr>
+        <w:annotationRef/>
+      </w:r>
+      <w:r>
+        <w:rPr>
+          <w:lang w:val="es-AR"/>
+        </w:rPr>
+        <w:t>implementado</w:t>
+      </w:r>
+    </w:p>
+  </w:comment>
+  <w:comment w:id="19" w:author="carlos jesus" w:date="2026-04-28T20:19:00Z" w:initials="cj">
+    <w:p>
+      <w:pPr>
+        <w:pStyle w:val="CommentText"/>
+      </w:pPr>
+      <w:r>
+        <w:rPr>
+          <w:rStyle w:val="CommentReference"/>
+        </w:rPr>
+        <w:annotationRef/>
+      </w:r>
+      <w:r>
+        <w:rPr>
+          <w:lang w:val="es-AR"/>
+        </w:rPr>
+        <w:t>Btn de descarga HTML ✅</w:t>
+      </w:r>
+    </w:p>
+  </w:comment>
+  <w:comment w:id="20" w:author="carlos jesus" w:date="2026-04-27T21:39:00Z" w:initials="cj">
+    <w:p>
+      <w:pPr>
+        <w:pStyle w:val="CommentText"/>
+      </w:pPr>
+      <w:r>
+        <w:rPr>
+          <w:rStyle w:val="CommentReference"/>
+        </w:rPr>
+        <w:annotationRef/>
+      </w:r>
+      <w:r>
+        <w:rPr>
+          <w:lang w:val="es-AR"/>
+        </w:rPr>
         <w:t>Comentar la decisión técnica elegida por otra.</w:t>
       </w:r>
     </w:p>
   </w:comment>
-  <w:comment w:id="7" w:author="carlos jesus" w:date="2026-04-27T17:39:00Z" w:initials="cj">
+  <w:comment w:id="21" w:author="carlos jesus" w:date="2026-04-27T17:39:00Z" w:initials="cj">
     <w:p>
       <w:r>
         <w:rPr>
@@ -8387,7 +9176,7 @@
       </w:r>
     </w:p>
   </w:comment>
-  <w:comment w:id="8" w:author="carlos jesus" w:date="2026-04-27T18:18:00Z" w:initials="cj">
+  <w:comment w:id="22" w:author="carlos jesus" w:date="2026-04-27T18:18:00Z" w:initials="cj">
     <w:p>
       <w:r>
         <w:rPr>
@@ -8423,7 +9212,21 @@
   <w15:commentEx w15:paraId="0D767755" w15:done="0"/>
   <w15:commentEx w15:paraId="76E0FC32" w15:paraIdParent="0D767755" w15:done="0"/>
   <w15:commentEx w15:paraId="2CA50FF9" w15:done="0"/>
-  <w15:commentEx w15:paraId="18E87BB7" w15:paraIdParent="2CA50FF9" w15:done="0"/>
+  <w15:commentEx w15:paraId="481E7407" w15:done="0"/>
+  <w15:commentEx w15:paraId="2318DF0D" w15:paraIdParent="481E7407" w15:done="0"/>
+  <w15:commentEx w15:paraId="6331F884" w15:done="0"/>
+  <w15:commentEx w15:paraId="20976163" w15:done="0"/>
+  <w15:commentEx w15:paraId="411B01D1" w15:done="0"/>
+  <w15:commentEx w15:paraId="22C97F7A" w15:done="0"/>
+  <w15:commentEx w15:paraId="3933B082" w15:done="0"/>
+  <w15:commentEx w15:paraId="53C5D7C5" w15:done="0"/>
+  <w15:commentEx w15:paraId="5C666122" w15:done="0"/>
+  <w15:commentEx w15:paraId="7982C168" w15:done="0"/>
+  <w15:commentEx w15:paraId="17FB0A7D" w15:done="0"/>
+  <w15:commentEx w15:paraId="38CE68E3" w15:done="0"/>
+  <w15:commentEx w15:paraId="62C43DFC" w15:done="0"/>
+  <w15:commentEx w15:paraId="34422BD1" w15:done="0"/>
+  <w15:commentEx w15:paraId="39618465" w15:done="0"/>
   <w15:commentEx w15:paraId="0382B807" w15:done="0"/>
   <w15:commentEx w15:paraId="21D94DD7" w15:done="0"/>
   <w15:commentEx w15:paraId="7897AE20" w15:done="0"/>
@@ -8437,7 +9240,21 @@
   <w16cex:commentExtensible w16cex:durableId="2996D81E" w16cex:dateUtc="2026-04-27T17:02:00Z"/>
   <w16cex:commentExtensible w16cex:durableId="1BAA9756" w16cex:dateUtc="2026-04-27T17:10:00Z"/>
   <w16cex:commentExtensible w16cex:durableId="543BAEC2" w16cex:dateUtc="2026-04-27T17:14:00Z"/>
-  <w16cex:commentExtensible w16cex:durableId="0F02158B" w16cex:dateUtc="2026-04-27T17:14:00Z"/>
+  <w16cex:commentExtensible w16cex:durableId="5D4603F9" w16cex:dateUtc="2026-04-28T21:52:00Z"/>
+  <w16cex:commentExtensible w16cex:durableId="31B7B4E1" w16cex:dateUtc="2026-04-28T21:54:00Z"/>
+  <w16cex:commentExtensible w16cex:durableId="38495B2F" w16cex:dateUtc="2026-04-28T20:25:00Z"/>
+  <w16cex:commentExtensible w16cex:durableId="5EDC442F" w16cex:dateUtc="2026-04-28T20:38:00Z"/>
+  <w16cex:commentExtensible w16cex:durableId="7429EB8D" w16cex:dateUtc="2026-04-28T20:44:00Z"/>
+  <w16cex:commentExtensible w16cex:durableId="355500BC" w16cex:dateUtc="2026-04-28T21:28:00Z"/>
+  <w16cex:commentExtensible w16cex:durableId="2207C08B" w16cex:dateUtc="2026-04-28T22:12:00Z"/>
+  <w16cex:commentExtensible w16cex:durableId="0EE600FE" w16cex:dateUtc="2026-04-28T22:15:00Z"/>
+  <w16cex:commentExtensible w16cex:durableId="14624C49" w16cex:dateUtc="2026-04-28T22:15:00Z"/>
+  <w16cex:commentExtensible w16cex:durableId="40890585" w16cex:dateUtc="2026-04-28T22:16:00Z"/>
+  <w16cex:commentExtensible w16cex:durableId="52A2E3B6" w16cex:dateUtc="2026-04-28T22:41:00Z"/>
+  <w16cex:commentExtensible w16cex:durableId="65E130D5" w16cex:dateUtc="2026-04-28T22:33:00Z"/>
+  <w16cex:commentExtensible w16cex:durableId="69E6D72F" w16cex:dateUtc="2026-04-28T23:19:00Z"/>
+  <w16cex:commentExtensible w16cex:durableId="1D01C01F" w16cex:dateUtc="2026-04-28T23:05:00Z"/>
+  <w16cex:commentExtensible w16cex:durableId="1D761BB8" w16cex:dateUtc="2026-04-28T23:19:00Z"/>
   <w16cex:commentExtensible w16cex:durableId="4A7AD03C" w16cex:dateUtc="2026-04-28T00:39:00Z"/>
   <w16cex:commentExtensible w16cex:durableId="23C5CBD7" w16cex:dateUtc="2026-04-27T20:39:00Z"/>
   <w16cex:commentExtensible w16cex:durableId="7883C08A" w16cex:dateUtc="2026-04-27T21:18:00Z"/>
@@ -8451,7 +9268,21 @@
   <w16cid:commentId w16cid:paraId="0D767755" w16cid:durableId="2996D81E"/>
   <w16cid:commentId w16cid:paraId="76E0FC32" w16cid:durableId="1BAA9756"/>
   <w16cid:commentId w16cid:paraId="2CA50FF9" w16cid:durableId="543BAEC2"/>
-  <w16cid:commentId w16cid:paraId="18E87BB7" w16cid:durableId="0F02158B"/>
+  <w16cid:commentId w16cid:paraId="481E7407" w16cid:durableId="5D4603F9"/>
+  <w16cid:commentId w16cid:paraId="2318DF0D" w16cid:durableId="31B7B4E1"/>
+  <w16cid:commentId w16cid:paraId="6331F884" w16cid:durableId="38495B2F"/>
+  <w16cid:commentId w16cid:paraId="20976163" w16cid:durableId="5EDC442F"/>
+  <w16cid:commentId w16cid:paraId="411B01D1" w16cid:durableId="7429EB8D"/>
+  <w16cid:commentId w16cid:paraId="22C97F7A" w16cid:durableId="355500BC"/>
+  <w16cid:commentId w16cid:paraId="3933B082" w16cid:durableId="2207C08B"/>
+  <w16cid:commentId w16cid:paraId="53C5D7C5" w16cid:durableId="0EE600FE"/>
+  <w16cid:commentId w16cid:paraId="5C666122" w16cid:durableId="14624C49"/>
+  <w16cid:commentId w16cid:paraId="7982C168" w16cid:durableId="40890585"/>
+  <w16cid:commentId w16cid:paraId="17FB0A7D" w16cid:durableId="52A2E3B6"/>
+  <w16cid:commentId w16cid:paraId="38CE68E3" w16cid:durableId="65E130D5"/>
+  <w16cid:commentId w16cid:paraId="62C43DFC" w16cid:durableId="69E6D72F"/>
+  <w16cid:commentId w16cid:paraId="34422BD1" w16cid:durableId="1D01C01F"/>
+  <w16cid:commentId w16cid:paraId="39618465" w16cid:durableId="1D761BB8"/>
   <w16cid:commentId w16cid:paraId="0382B807" w16cid:durableId="4A7AD03C"/>
   <w16cid:commentId w16cid:paraId="21D94DD7" w16cid:durableId="23C5CBD7"/>
   <w16cid:commentId w16cid:paraId="7897AE20" w16cid:durableId="7883C08A"/>
@@ -10050,28 +10881,28 @@
 </file>
 
 <file path=customXml/item1.xml><?xml version="1.0" encoding="utf-8"?>
+<b:Sources xmlns:b="http://schemas.openxmlformats.org/officeDocument/2006/bibliography" xmlns="http://schemas.openxmlformats.org/officeDocument/2006/bibliography" SelectedStyle="\APASixthEditionOfficeOnline.xsl" StyleName="APA" Version="6"/>
+</file>
+
+<file path=customXml/item2.xml><?xml version="1.0" encoding="utf-8"?>
 <go:gDocsCustomXmlDataStorage xmlns:go="http://customooxmlschemas.google.com/" xmlns:r="http://schemas.openxmlformats.org/officeDocument/2006/relationships" uri="GoogleDocsCustomDataVersion2">
   <go:docsCustomData xmlns:go="http://customooxmlschemas.google.com/" roundtripDataSignature="AMtx7mjiPToPaI9PqYT6ySQlvx7t33ijtA==">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</go:docsCustomData>
 </go:gDocsCustomXmlDataStorage>
 </file>
 
-<file path=customXml/item2.xml><?xml version="1.0" encoding="utf-8"?>
-<b:Sources xmlns:b="http://schemas.openxmlformats.org/officeDocument/2006/bibliography" xmlns="http://schemas.openxmlformats.org/officeDocument/2006/bibliography" SelectedStyle="\APASixthEditionOfficeOnline.xsl" StyleName="APA" Version="6"/>
+<file path=customXml/itemProps1.xml><?xml version="1.0" encoding="utf-8"?>
+<ds:datastoreItem xmlns:ds="http://schemas.openxmlformats.org/officeDocument/2006/customXml" ds:itemID="{1E1E4DF4-C5E7-4814-AEF0-470220A80B93}">
+  <ds:schemaRefs>
+    <ds:schemaRef ds:uri="http://schemas.openxmlformats.org/officeDocument/2006/bibliography"/>
+  </ds:schemaRefs>
+</ds:datastoreItem>
 </file>
 
-<file path=customXml/itemProps1.xml><?xml version="1.0" encoding="utf-8"?>
+<file path=customXml/itemProps2.xml><?xml version="1.0" encoding="utf-8"?>
 <ds:datastoreItem xmlns:ds="http://schemas.openxmlformats.org/officeDocument/2006/customXml" ds:itemID="{11111111-1234-1234-1234-123412341234}">
   <ds:schemaRefs>
     <ds:schemaRef ds:uri="http://customooxmlschemas.google.com/"/>
     <ds:schemaRef ds:uri="http://schemas.openxmlformats.org/officeDocument/2006/relationships"/>
   </ds:schemaRefs>
 </ds:datastoreItem>
-</file>
-
-<file path=customXml/itemProps2.xml><?xml version="1.0" encoding="utf-8"?>
-<ds:datastoreItem xmlns:ds="http://schemas.openxmlformats.org/officeDocument/2006/customXml" ds:itemID="{1E1E4DF4-C5E7-4814-AEF0-470220A80B93}">
-  <ds:schemaRefs>
-    <ds:schemaRef ds:uri="http://schemas.openxmlformats.org/officeDocument/2006/bibliography"/>
-  </ds:schemaRefs>
-</ds:datastoreItem>
 </file>
</xml_diff>